<commit_message>
Steps 22-25: re-checks, Whisper-encoder detector (new default), three attackers, release v2, paper draft
</commit_message>
<xml_diff>
--- a/reports/Progress_Report_2026-10-21.docx
+++ b/reports/Progress_Report_2026-10-21.docx
@@ -2581,6 +2581,956 @@
         <w:pStyle w:val="Heading2"/>
       </w:pPr>
       <w:r>
+        <w:t xml:space="preserve">Steps 22–24: re-checking the evaluation, and an anonymized copy (added 22 October)</w:t>
+      </w:r>
+    </w:p>
+    <w:p>
+      <w:pPr/>
+      <w:r>
+        <w:t xml:space="preserve">The re-checks confirm the results above: no speech hides outside the annotations, and a 3x larger attacker does not change the ranking. They also show that the dog cost depends strongly on the call type.</w:t>
+      </w:r>
+    </w:p>
+    <w:p>
+      <w:pPr/>
+      <w:r>
+        <w:rPr>
+          <w:b/>
+        </w:rPr>
+        <w:t xml:space="preserve">22a. Dog calls counted as events.</w:t>
+      </w:r>
+      <w:r>
+        <w:t xml:space="preserve"> 89% of the annotated dog time is panting, so "dog time lost" was mostly a panting number. Counting each call with no human sound on it (intact = not one sample muted; lost = half or more muted):</w:t>
+      </w:r>
+    </w:p>
+    <w:tbl>
+      <w:tblPr>
+        <w:tblStyle w:val="TableGrid"/>
+        <w:tblW w:w="0" w:type="auto"/>
+        <w:tblLayout w:type="fixed"/>
+        <w:tblLook w:val="04A0" w:firstRow="1" w:lastRow="0" w:firstColumn="0" w:lastColumn="0" w:noHBand="0" w:noVBand="1"/>
+      </w:tblPr>
+      <w:tblGrid>
+        <w:gridCol w:w="2058"/>
+        <w:gridCol w:w="2739"/>
+        <w:gridCol w:w="2834"/>
+        <w:gridCol w:w="1729"/>
+      </w:tblGrid>
+      <w:tr>
+        <w:trPr>
+          <w:tblHeader/>
+        </w:trPr>
+        <w:tc>
+          <w:tcPr>
+            <w:tcW w:w="2058" w:type="dxa"/>
+            <w:shd w:val="clear" w:color="auto" w:fill="F2F2F2"/>
+          </w:tcPr>
+          <w:p>
+            <w:pPr/>
+            <w:r>
+              <w:t xml:space="preserve">call type (events)</w:t>
+            </w:r>
+          </w:p>
+        </w:tc>
+        <w:tc>
+          <w:tcPr>
+            <w:tcW w:w="2739" w:type="dxa"/>
+            <w:shd w:val="clear" w:color="auto" w:fill="F2F2F2"/>
+          </w:tcPr>
+          <w:p>
+            <w:pPr/>
+            <w:r>
+              <w:t xml:space="preserve">VGGish, 6%: intact / lost</w:t>
+            </w:r>
+          </w:p>
+        </w:tc>
+        <w:tc>
+          <w:tcPr>
+            <w:tcW w:w="2834" w:type="dxa"/>
+            <w:shd w:val="clear" w:color="auto" w:fill="F2F2F2"/>
+          </w:tcPr>
+          <w:p>
+            <w:pPr/>
+            <w:r>
+              <w:t xml:space="preserve">mn40 standard: intact / lost</w:t>
+            </w:r>
+          </w:p>
+        </w:tc>
+        <w:tc>
+          <w:tcPr>
+            <w:tcW w:w="1729" w:type="dxa"/>
+            <w:shd w:val="clear" w:color="auto" w:fill="F2F2F2"/>
+          </w:tcPr>
+          <w:p>
+            <w:pPr/>
+            <w:r>
+              <w:t xml:space="preserve">Step 23 model, standard: intact</w:t>
+            </w:r>
+          </w:p>
+        </w:tc>
+      </w:tr>
+      <w:tr>
+        <w:tc>
+          <w:tcPr>
+            <w:tcW w:w="2058" w:type="dxa"/>
+          </w:tcPr>
+          <w:p>
+            <w:pPr/>
+            <w:r>
+              <w:t xml:space="preserve">Pant (1,116)</w:t>
+            </w:r>
+          </w:p>
+        </w:tc>
+        <w:tc>
+          <w:tcPr>
+            <w:tcW w:w="2739" w:type="dxa"/>
+          </w:tcPr>
+          <w:p>
+            <w:pPr/>
+            <w:r>
+              <w:t xml:space="preserve">77% / 6%</w:t>
+            </w:r>
+          </w:p>
+        </w:tc>
+        <w:tc>
+          <w:tcPr>
+            <w:tcW w:w="2834" w:type="dxa"/>
+          </w:tcPr>
+          <w:p>
+            <w:pPr/>
+            <w:r>
+              <w:t xml:space="preserve">71% / 15%</w:t>
+            </w:r>
+          </w:p>
+        </w:tc>
+        <w:tc>
+          <w:tcPr>
+            <w:tcW w:w="1729" w:type="dxa"/>
+          </w:tcPr>
+          <w:p>
+            <w:pPr/>
+            <w:r>
+              <w:t xml:space="preserve">68%</w:t>
+            </w:r>
+          </w:p>
+        </w:tc>
+      </w:tr>
+      <w:tr>
+        <w:tc>
+          <w:tcPr>
+            <w:tcW w:w="2058" w:type="dxa"/>
+          </w:tcPr>
+          <w:p>
+            <w:pPr/>
+            <w:r>
+              <w:t xml:space="preserve">Growl (188)</w:t>
+            </w:r>
+          </w:p>
+        </w:tc>
+        <w:tc>
+          <w:tcPr>
+            <w:tcW w:w="2739" w:type="dxa"/>
+          </w:tcPr>
+          <w:p>
+            <w:pPr/>
+            <w:r>
+              <w:t xml:space="preserve">79% / 12%</w:t>
+            </w:r>
+          </w:p>
+        </w:tc>
+        <w:tc>
+          <w:tcPr>
+            <w:tcW w:w="2834" w:type="dxa"/>
+          </w:tcPr>
+          <w:p>
+            <w:pPr/>
+            <w:r>
+              <w:t xml:space="preserve">90% / 7%</w:t>
+            </w:r>
+          </w:p>
+        </w:tc>
+        <w:tc>
+          <w:tcPr>
+            <w:tcW w:w="1729" w:type="dxa"/>
+          </w:tcPr>
+          <w:p>
+            <w:pPr/>
+            <w:r>
+              <w:t xml:space="preserve">90%</w:t>
+            </w:r>
+          </w:p>
+        </w:tc>
+      </w:tr>
+      <w:tr>
+        <w:tc>
+          <w:tcPr>
+            <w:tcW w:w="2058" w:type="dxa"/>
+          </w:tcPr>
+          <w:p>
+            <w:pPr/>
+            <w:r>
+              <w:t xml:space="preserve">Grunt (159)</w:t>
+            </w:r>
+          </w:p>
+        </w:tc>
+        <w:tc>
+          <w:tcPr>
+            <w:tcW w:w="2739" w:type="dxa"/>
+          </w:tcPr>
+          <w:p>
+            <w:pPr/>
+            <w:r>
+              <w:t xml:space="preserve">77% / 18%</w:t>
+            </w:r>
+          </w:p>
+        </w:tc>
+        <w:tc>
+          <w:tcPr>
+            <w:tcW w:w="2834" w:type="dxa"/>
+          </w:tcPr>
+          <w:p>
+            <w:pPr/>
+            <w:r>
+              <w:t xml:space="preserve">66% / 28%</w:t>
+            </w:r>
+          </w:p>
+        </w:tc>
+        <w:tc>
+          <w:tcPr>
+            <w:tcW w:w="1729" w:type="dxa"/>
+          </w:tcPr>
+          <w:p>
+            <w:pPr/>
+            <w:r>
+              <w:t xml:space="preserve">77%</w:t>
+            </w:r>
+          </w:p>
+        </w:tc>
+      </w:tr>
+      <w:tr>
+        <w:tc>
+          <w:tcPr>
+            <w:tcW w:w="2058" w:type="dxa"/>
+          </w:tcPr>
+          <w:p>
+            <w:pPr/>
+            <w:r>
+              <w:t xml:space="preserve">Bark/yelp (48)</w:t>
+            </w:r>
+          </w:p>
+        </w:tc>
+        <w:tc>
+          <w:tcPr>
+            <w:tcW w:w="2739" w:type="dxa"/>
+          </w:tcPr>
+          <w:p>
+            <w:pPr/>
+            <w:r>
+              <w:t xml:space="preserve">83% / 6%</w:t>
+            </w:r>
+          </w:p>
+        </w:tc>
+        <w:tc>
+          <w:tcPr>
+            <w:tcW w:w="2834" w:type="dxa"/>
+          </w:tcPr>
+          <w:p>
+            <w:pPr/>
+            <w:r>
+              <w:t xml:space="preserve">75% / 19%</w:t>
+            </w:r>
+          </w:p>
+        </w:tc>
+        <w:tc>
+          <w:tcPr>
+            <w:tcW w:w="1729" w:type="dxa"/>
+          </w:tcPr>
+          <w:p>
+            <w:pPr/>
+            <w:r>
+              <w:t xml:space="preserve">81%</w:t>
+            </w:r>
+          </w:p>
+        </w:tc>
+      </w:tr>
+      <w:tr>
+        <w:tc>
+          <w:tcPr>
+            <w:tcW w:w="2058" w:type="dxa"/>
+          </w:tcPr>
+          <w:p>
+            <w:pPr/>
+            <w:r>
+              <w:t xml:space="preserve">Moan (32)</w:t>
+            </w:r>
+          </w:p>
+        </w:tc>
+        <w:tc>
+          <w:tcPr>
+            <w:tcW w:w="2739" w:type="dxa"/>
+          </w:tcPr>
+          <w:p>
+            <w:pPr/>
+            <w:r>
+              <w:t xml:space="preserve">56% / 34%</w:t>
+            </w:r>
+          </w:p>
+        </w:tc>
+        <w:tc>
+          <w:tcPr>
+            <w:tcW w:w="2834" w:type="dxa"/>
+          </w:tcPr>
+          <w:p>
+            <w:pPr/>
+            <w:r>
+              <w:t xml:space="preserve">62% / 28%</w:t>
+            </w:r>
+          </w:p>
+        </w:tc>
+        <w:tc>
+          <w:tcPr>
+            <w:tcW w:w="1729" w:type="dxa"/>
+          </w:tcPr>
+          <w:p>
+            <w:pPr/>
+            <w:r>
+              <w:t xml:space="preserve">69%</w:t>
+            </w:r>
+          </w:p>
+        </w:tc>
+      </w:tr>
+      <w:tr>
+        <w:tc>
+          <w:tcPr>
+            <w:tcW w:w="2058" w:type="dxa"/>
+          </w:tcPr>
+          <w:p>
+            <w:pPr/>
+            <w:r>
+              <w:t xml:space="preserve">Whine (7)</w:t>
+            </w:r>
+          </w:p>
+        </w:tc>
+        <w:tc>
+          <w:tcPr>
+            <w:tcW w:w="2739" w:type="dxa"/>
+          </w:tcPr>
+          <w:p>
+            <w:pPr/>
+            <w:r>
+              <w:t xml:space="preserve">43% / 57%</w:t>
+            </w:r>
+          </w:p>
+        </w:tc>
+        <w:tc>
+          <w:tcPr>
+            <w:tcW w:w="2834" w:type="dxa"/>
+          </w:tcPr>
+          <w:p>
+            <w:pPr/>
+            <w:r>
+              <w:t xml:space="preserve">14% / 86%</w:t>
+            </w:r>
+          </w:p>
+        </w:tc>
+        <w:tc>
+          <w:tcPr>
+            <w:tcW w:w="1729" w:type="dxa"/>
+          </w:tcPr>
+          <w:p>
+            <w:pPr/>
+            <w:r>
+              <w:t xml:space="preserve">–</w:t>
+            </w:r>
+          </w:p>
+        </w:tc>
+      </w:tr>
+    </w:tbl>
+    <w:p>
+      <w:pPr/>
+      <w:r>
+        <w:t xml:space="preserve">Whines are the one call the detector takes for a human voice (6 of 7 lost). Which calls matter most decides the right setting.</w:t>
+      </w:r>
+    </w:p>
+    <w:p>
+      <w:pPr/>
+      <w:r>
+        <w:rPr>
+          <w:b/>
+        </w:rPr>
+        <w:t xml:space="preserve">22b. Whole recordings.</w:t>
+      </w:r>
+      <w:r>
+        <w:t xml:space="preserve"> Whisper read every 8 s window with no annotated human sound within 0.5 s (519 windows, 68 min, about half of all audio). Ten windows gave 2+ "words": eight were typical hallucinations ("2.5kg" five times, Russian "anxious music" twice), two were short Korean phrases on Hungarian audio. No unannotated speech was found, so the event-based privacy numbers are complete.</w:t>
+      </w:r>
+    </w:p>
+    <w:p>
+      <w:pPr/>
+      <w:r>
+        <w:rPr>
+          <w:b/>
+        </w:rPr>
+        <w:t xml:space="preserve">22c. A stronger attacker.</w:t>
+      </w:r>
+      <w:r>
+        <w:t xml:space="preserve"> Whisper large-v3-turbo (809M parameters, vs 244M for Whisper small) read the same 581 event windows.</w:t>
+      </w:r>
+    </w:p>
+    <w:tbl>
+      <w:tblPr>
+        <w:tblStyle w:val="TableGrid"/>
+        <w:tblW w:w="0" w:type="auto"/>
+        <w:tblLayout w:type="fixed"/>
+        <w:tblLook w:val="04A0" w:firstRow="1" w:lastRow="0" w:firstColumn="0" w:lastColumn="0" w:noHBand="0" w:noVBand="1"/>
+      </w:tblPr>
+      <w:tblGrid>
+        <w:gridCol w:w="3253"/>
+        <w:gridCol w:w="3180"/>
+        <w:gridCol w:w="2927"/>
+      </w:tblGrid>
+      <w:tr>
+        <w:trPr>
+          <w:tblHeader/>
+        </w:trPr>
+        <w:tc>
+          <w:tcPr>
+            <w:tcW w:w="3253" w:type="dxa"/>
+            <w:shd w:val="clear" w:color="auto" w:fill="F2F2F2"/>
+          </w:tcPr>
+          <w:p>
+            <w:pPr/>
+            <w:r>
+              <w:t xml:space="preserve">version</w:t>
+            </w:r>
+          </w:p>
+        </w:tc>
+        <w:tc>
+          <w:tcPr>
+            <w:tcW w:w="3180" w:type="dxa"/>
+            <w:shd w:val="clear" w:color="auto" w:fill="F2F2F2"/>
+          </w:tcPr>
+          <w:p>
+            <w:pPr/>
+            <w:r>
+              <w:t xml:space="preserve">turbo: events with 2+ words</w:t>
+            </w:r>
+          </w:p>
+        </w:tc>
+        <w:tc>
+          <w:tcPr>
+            <w:tcW w:w="2927" w:type="dxa"/>
+            <w:shd w:val="clear" w:color="auto" w:fill="F2F2F2"/>
+          </w:tcPr>
+          <w:p>
+            <w:pPr/>
+            <w:r>
+              <w:t xml:space="preserve">confirmed speech still leaking (of 34)</w:t>
+            </w:r>
+          </w:p>
+        </w:tc>
+      </w:tr>
+      <w:tr>
+        <w:tc>
+          <w:tcPr>
+            <w:tcW w:w="3253" w:type="dxa"/>
+          </w:tcPr>
+          <w:p>
+            <w:pPr/>
+            <w:r>
+              <w:t xml:space="preserve">original</w:t>
+            </w:r>
+          </w:p>
+        </w:tc>
+        <w:tc>
+          <w:tcPr>
+            <w:tcW w:w="3180" w:type="dxa"/>
+          </w:tcPr>
+          <w:p>
+            <w:pPr/>
+            <w:r>
+              <w:t xml:space="preserve">41.0%</w:t>
+            </w:r>
+          </w:p>
+        </w:tc>
+        <w:tc>
+          <w:tcPr>
+            <w:tcW w:w="2927" w:type="dxa"/>
+          </w:tcPr>
+          <w:p>
+            <w:pPr/>
+            <w:r>
+              <w:t xml:space="preserve">34</w:t>
+            </w:r>
+          </w:p>
+        </w:tc>
+      </w:tr>
+      <w:tr>
+        <w:tc>
+          <w:tcPr>
+            <w:tcW w:w="3253" w:type="dxa"/>
+          </w:tcPr>
+          <w:p>
+            <w:pPr/>
+            <w:r>
+              <w:t xml:space="preserve">background, no human (floor)</w:t>
+            </w:r>
+          </w:p>
+        </w:tc>
+        <w:tc>
+          <w:tcPr>
+            <w:tcW w:w="3180" w:type="dxa"/>
+          </w:tcPr>
+          <w:p>
+            <w:pPr/>
+            <w:r>
+              <w:t xml:space="preserve">24.5%</w:t>
+            </w:r>
+          </w:p>
+        </w:tc>
+        <w:tc>
+          <w:tcPr>
+            <w:tcW w:w="2927" w:type="dxa"/>
+          </w:tcPr>
+          <w:p>
+            <w:pPr/>
+            <w:r>
+              <w:t xml:space="preserve">–</w:t>
+            </w:r>
+          </w:p>
+        </w:tc>
+      </w:tr>
+      <w:tr>
+        <w:tc>
+          <w:tcPr>
+            <w:tcW w:w="3253" w:type="dxa"/>
+          </w:tcPr>
+          <w:p>
+            <w:pPr/>
+            <w:r>
+              <w:t xml:space="preserve">VGGish, 6%</w:t>
+            </w:r>
+          </w:p>
+        </w:tc>
+        <w:tc>
+          <w:tcPr>
+            <w:tcW w:w="3180" w:type="dxa"/>
+          </w:tcPr>
+          <w:p>
+            <w:pPr/>
+            <w:r>
+              <w:t xml:space="preserve">20.7%</w:t>
+            </w:r>
+          </w:p>
+        </w:tc>
+        <w:tc>
+          <w:tcPr>
+            <w:tcW w:w="2927" w:type="dxa"/>
+          </w:tcPr>
+          <w:p>
+            <w:pPr/>
+            <w:r>
+              <w:t xml:space="preserve">6</w:t>
+            </w:r>
+          </w:p>
+        </w:tc>
+      </w:tr>
+      <w:tr>
+        <w:tc>
+          <w:tcPr>
+            <w:tcW w:w="3253" w:type="dxa"/>
+          </w:tcPr>
+          <w:p>
+            <w:pPr/>
+            <w:r>
+              <w:t xml:space="preserve">mn40 light (6%)</w:t>
+            </w:r>
+          </w:p>
+        </w:tc>
+        <w:tc>
+          <w:tcPr>
+            <w:tcW w:w="3180" w:type="dxa"/>
+          </w:tcPr>
+          <w:p>
+            <w:pPr/>
+            <w:r>
+              <w:t xml:space="preserve">10.3%</w:t>
+            </w:r>
+          </w:p>
+        </w:tc>
+        <w:tc>
+          <w:tcPr>
+            <w:tcW w:w="2927" w:type="dxa"/>
+          </w:tcPr>
+          <w:p>
+            <w:pPr/>
+            <w:r>
+              <w:t xml:space="preserve">2</w:t>
+            </w:r>
+          </w:p>
+        </w:tc>
+      </w:tr>
+      <w:tr>
+        <w:tc>
+          <w:tcPr>
+            <w:tcW w:w="3253" w:type="dxa"/>
+          </w:tcPr>
+          <w:p>
+            <w:pPr/>
+            <w:r>
+              <w:t xml:space="preserve">mn40 standard (10%)</w:t>
+            </w:r>
+          </w:p>
+        </w:tc>
+        <w:tc>
+          <w:tcPr>
+            <w:tcW w:w="3180" w:type="dxa"/>
+          </w:tcPr>
+          <w:p>
+            <w:pPr/>
+            <w:r>
+              <w:t xml:space="preserve">7.1%</w:t>
+            </w:r>
+          </w:p>
+        </w:tc>
+        <w:tc>
+          <w:tcPr>
+            <w:tcW w:w="2927" w:type="dxa"/>
+          </w:tcPr>
+          <w:p>
+            <w:pPr/>
+            <w:r>
+              <w:t xml:space="preserve">1</w:t>
+            </w:r>
+          </w:p>
+        </w:tc>
+      </w:tr>
+      <w:tr>
+        <w:tc>
+          <w:tcPr>
+            <w:tcW w:w="3253" w:type="dxa"/>
+          </w:tcPr>
+          <w:p>
+            <w:pPr/>
+            <w:r>
+              <w:t xml:space="preserve">Step 23 model, standard</w:t>
+            </w:r>
+          </w:p>
+        </w:tc>
+        <w:tc>
+          <w:tcPr>
+            <w:tcW w:w="3180" w:type="dxa"/>
+          </w:tcPr>
+          <w:p>
+            <w:pPr/>
+            <w:r>
+              <w:t xml:space="preserve">6.9%</w:t>
+            </w:r>
+          </w:p>
+        </w:tc>
+        <w:tc>
+          <w:tcPr>
+            <w:tcW w:w="2927" w:type="dxa"/>
+          </w:tcPr>
+          <w:p>
+            <w:pPr/>
+            <w:r>
+              <w:t xml:space="preserve">0</w:t>
+            </w:r>
+          </w:p>
+        </w:tc>
+      </w:tr>
+    </w:tbl>
+    <w:p>
+      <w:pPr/>
+      <w:r>
+        <w:t xml:space="preserve">Turbo invents text on a quarter of the windows with nobody talking, so its raw rates overstate leaks. "Confirmed speech" = the 34 events where both recognizers read 2+ words in the original and agree on at least half of them; an event still leaks if either reads back 2+ of those words after muting. The one leak at standard is the phrase "she's like".</w:t>
+      </w:r>
+    </w:p>
+    <w:p>
+      <w:pPr/>
+      <w:r>
+        <w:rPr>
+          <w:b/>
+        </w:rPr>
+        <w:t xml:space="preserve">23. Training for the actual trade-off.</w:t>
+      </w:r>
+      <w:r>
+        <w:t xml:space="preserve"> The detector was trained to separate human frames from everything else, including room noise that costs nothing to mute. Training human vs dog-only frames (same model, no tuning) finds more human time at the same dog cost: 74.3 / 82.5 / 86.7% vs 72.0 / 79.8 / 85.0% at 6 / 10 / 15%. Readable events drop to 1.9 / 1.2 / 0.7% (from 2.2 / 1.4 / 0.9%; not significant, p ≥ 0.6). It mutes more background (29% vs 17% at 10%). Training only on readable speech, per-recording score normalization, and subtracting a dog detector did not help.</w:t>
+      </w:r>
+    </w:p>
+    <w:p>
+      <w:pPr/>
+      <w:r>
+        <w:rPr>
+          <w:b/>
+        </w:rPr>
+        <w:t xml:space="preserve">24. An anonymized copy of the dataset.</w:t>
+      </w:r>
+      <w:r>
+        <w:t xml:space="preserve"> The final model marked what to mute in all 30 sessions, and the muting was applied to the original 48 kHz files in their own format. Every sample outside the muted parts is bit-identical to the original (30 of 30 checks pass; SHA-256 manifest).</w:t>
+      </w:r>
+    </w:p>
+    <w:tbl>
+      <w:tblPr>
+        <w:tblStyle w:val="TableGrid"/>
+        <w:tblW w:w="0" w:type="auto"/>
+        <w:tblLayout w:type="fixed"/>
+        <w:tblLook w:val="04A0" w:firstRow="1" w:lastRow="0" w:firstColumn="0" w:lastColumn="0" w:noHBand="0" w:noVBand="1"/>
+      </w:tblPr>
+      <w:tblGrid>
+        <w:gridCol w:w="1108"/>
+        <w:gridCol w:w="2084"/>
+        <w:gridCol w:w="3075"/>
+        <w:gridCol w:w="1629"/>
+        <w:gridCol w:w="1464"/>
+      </w:tblGrid>
+      <w:tr>
+        <w:trPr>
+          <w:tblHeader/>
+        </w:trPr>
+        <w:tc>
+          <w:tcPr>
+            <w:tcW w:w="1108" w:type="dxa"/>
+            <w:shd w:val="clear" w:color="auto" w:fill="F2F2F2"/>
+          </w:tcPr>
+          <w:p>
+            <w:pPr/>
+            <w:r>
+              <w:t xml:space="preserve">level</w:t>
+            </w:r>
+          </w:p>
+        </w:tc>
+        <w:tc>
+          <w:tcPr>
+            <w:tcW w:w="2084" w:type="dxa"/>
+            <w:shd w:val="clear" w:color="auto" w:fill="F2F2F2"/>
+          </w:tcPr>
+          <w:p>
+            <w:pPr/>
+            <w:r>
+              <w:t xml:space="preserve">audio muted (of 125 min)</w:t>
+            </w:r>
+          </w:p>
+        </w:tc>
+        <w:tc>
+          <w:tcPr>
+            <w:tcW w:w="3075" w:type="dxa"/>
+            <w:shd w:val="clear" w:color="auto" w:fill="F2F2F2"/>
+          </w:tcPr>
+          <w:p>
+            <w:pPr/>
+            <w:r>
+              <w:t xml:space="preserve">annotated human events mostly muted</w:t>
+            </w:r>
+          </w:p>
+        </w:tc>
+        <w:tc>
+          <w:tcPr>
+            <w:tcW w:w="1629" w:type="dxa"/>
+            <w:shd w:val="clear" w:color="auto" w:fill="F2F2F2"/>
+          </w:tcPr>
+          <w:p>
+            <w:pPr/>
+            <w:r>
+              <w:t xml:space="preserve">growls intact</w:t>
+            </w:r>
+          </w:p>
+        </w:tc>
+        <w:tc>
+          <w:tcPr>
+            <w:tcW w:w="1464" w:type="dxa"/>
+            <w:shd w:val="clear" w:color="auto" w:fill="F2F2F2"/>
+          </w:tcPr>
+          <w:p>
+            <w:pPr/>
+            <w:r>
+              <w:t xml:space="preserve">pants intact</w:t>
+            </w:r>
+          </w:p>
+        </w:tc>
+      </w:tr>
+      <w:tr>
+        <w:tc>
+          <w:tcPr>
+            <w:tcW w:w="1108" w:type="dxa"/>
+          </w:tcPr>
+          <w:p>
+            <w:pPr/>
+            <w:r>
+              <w:t xml:space="preserve">light</w:t>
+            </w:r>
+          </w:p>
+        </w:tc>
+        <w:tc>
+          <w:tcPr>
+            <w:tcW w:w="2084" w:type="dxa"/>
+          </w:tcPr>
+          <w:p>
+            <w:pPr/>
+            <w:r>
+              <w:t xml:space="preserve">18.5%</w:t>
+            </w:r>
+          </w:p>
+        </w:tc>
+        <w:tc>
+          <w:tcPr>
+            <w:tcW w:w="3075" w:type="dxa"/>
+          </w:tcPr>
+          <w:p>
+            <w:pPr/>
+            <w:r>
+              <w:t xml:space="preserve">450 / 581</w:t>
+            </w:r>
+          </w:p>
+        </w:tc>
+        <w:tc>
+          <w:tcPr>
+            <w:tcW w:w="1629" w:type="dxa"/>
+          </w:tcPr>
+          <w:p>
+            <w:pPr/>
+            <w:r>
+              <w:t xml:space="preserve">179 / 188</w:t>
+            </w:r>
+          </w:p>
+        </w:tc>
+        <w:tc>
+          <w:tcPr>
+            <w:tcW w:w="1464" w:type="dxa"/>
+          </w:tcPr>
+          <w:p>
+            <w:pPr/>
+            <w:r>
+              <w:t xml:space="preserve">918 / 1,116</w:t>
+            </w:r>
+          </w:p>
+        </w:tc>
+      </w:tr>
+      <w:tr>
+        <w:tc>
+          <w:tcPr>
+            <w:tcW w:w="1108" w:type="dxa"/>
+          </w:tcPr>
+          <w:p>
+            <w:pPr/>
+            <w:r>
+              <w:t xml:space="preserve">standard</w:t>
+            </w:r>
+          </w:p>
+        </w:tc>
+        <w:tc>
+          <w:tcPr>
+            <w:tcW w:w="2084" w:type="dxa"/>
+          </w:tcPr>
+          <w:p>
+            <w:pPr/>
+            <w:r>
+              <w:t xml:space="preserve">24.1%</w:t>
+            </w:r>
+          </w:p>
+        </w:tc>
+        <w:tc>
+          <w:tcPr>
+            <w:tcW w:w="3075" w:type="dxa"/>
+          </w:tcPr>
+          <w:p>
+            <w:pPr/>
+            <w:r>
+              <w:t xml:space="preserve">495 / 581</w:t>
+            </w:r>
+          </w:p>
+        </w:tc>
+        <w:tc>
+          <w:tcPr>
+            <w:tcW w:w="1629" w:type="dxa"/>
+          </w:tcPr>
+          <w:p>
+            <w:pPr/>
+            <w:r>
+              <w:t xml:space="preserve">176 / 188</w:t>
+            </w:r>
+          </w:p>
+        </w:tc>
+        <w:tc>
+          <w:tcPr>
+            <w:tcW w:w="1464" w:type="dxa"/>
+          </w:tcPr>
+          <w:p>
+            <w:pPr/>
+            <w:r>
+              <w:t xml:space="preserve">811 / 1,116</w:t>
+            </w:r>
+          </w:p>
+        </w:tc>
+      </w:tr>
+      <w:tr>
+        <w:tc>
+          <w:tcPr>
+            <w:tcW w:w="1108" w:type="dxa"/>
+          </w:tcPr>
+          <w:p>
+            <w:pPr/>
+            <w:r>
+              <w:t xml:space="preserve">strict</w:t>
+            </w:r>
+          </w:p>
+        </w:tc>
+        <w:tc>
+          <w:tcPr>
+            <w:tcW w:w="2084" w:type="dxa"/>
+          </w:tcPr>
+          <w:p>
+            <w:pPr/>
+            <w:r>
+              <w:t xml:space="preserve">29.9%</w:t>
+            </w:r>
+          </w:p>
+        </w:tc>
+        <w:tc>
+          <w:tcPr>
+            <w:tcW w:w="3075" w:type="dxa"/>
+          </w:tcPr>
+          <w:p>
+            <w:pPr/>
+            <w:r>
+              <w:t xml:space="preserve">520 / 581</w:t>
+            </w:r>
+          </w:p>
+        </w:tc>
+        <w:tc>
+          <w:tcPr>
+            <w:tcW w:w="1629" w:type="dxa"/>
+          </w:tcPr>
+          <w:p>
+            <w:pPr/>
+            <w:r>
+              <w:t xml:space="preserve">167 / 188</w:t>
+            </w:r>
+          </w:p>
+        </w:tc>
+        <w:tc>
+          <w:tcPr>
+            <w:tcW w:w="1464" w:type="dxa"/>
+          </w:tcPr>
+          <w:p>
+            <w:pPr/>
+            <w:r>
+              <w:t xml:space="preserve">729 / 1,116</w:t>
+            </w:r>
+          </w:p>
+        </w:tc>
+      </w:tr>
+    </w:tbl>
+    <w:p>
+      <w:pPr/>
+      <w:r>
+        <w:t xml:space="preserve">The model has seen these participants, so these counts are optimistic; the leave-one-participant-out numbers are the estimate for new data. The files stay on the lab's computers until the dataset question is settled.</w:t>
+      </w:r>
+    </w:p>
+    <w:p>
+      <w:pPr>
+        <w:pStyle w:val="Heading2"/>
+      </w:pPr>
+      <w:r>
         <w:t xml:space="preserve">Limitations, next steps and questions</w:t>
       </w:r>
     </w:p>
@@ -2602,7 +3552,7 @@
         </w:numPr>
       </w:pPr>
       <w:r>
-        <w:t xml:space="preserve">The privacy check is automatic. It uses Whisper small, a strong but not the strongest recognizer, and no human listening test has been done yet.</w:t>
+        <w:t xml:space="preserve">The privacy check is automatic. It uses Whisper small, cross-checked with Whisper large-v3-turbo in Step 22c. No human listening test has been done yet.</w:t>
       </w:r>
     </w:p>
     <w:p>
@@ -2695,7 +3645,7 @@
         </w:numPr>
       </w:pPr>
       <w:r>
-        <w:t xml:space="preserve">A check with a stronger "attacker" (a larger Whisper model).</w:t>
+        <w:t xml:space="preserve">Choose the setting and the model (Step 18 or Step 23) once the lab says which dog calls matter.</w:t>
       </w:r>
     </w:p>
     <w:p>
@@ -2707,7 +3657,7 @@
         </w:numPr>
       </w:pPr>
       <w:r>
-        <w:t xml:space="preserve">A written report or paper draft of Steps 1–21.</w:t>
+        <w:t xml:space="preserve">A written report or paper draft of Steps 1–24.</w:t>
       </w:r>
     </w:p>
     <w:p>
@@ -2740,7 +3690,7 @@
         </w:numPr>
       </w:pPr>
       <w:r>
-        <w:t xml:space="preserve">Which trade-off does the lab prefer: light (2.2% readable, 7.9% dog lost), standard (1.4%, 12.5%) or strict (0.9%, 17.9%)?</w:t>
+        <w:t xml:space="preserve">Which dog sounds matter most for the lab's analyses? Growls and barks are kept well at every level, while pants, grunts and the few whines lose more (Step 22a). This decides between light (2.2% readable), standard (1.4%) and strict (0.9%).</w:t>
       </w:r>
     </w:p>
     <w:p>

</xml_diff>